<commit_message>
Made changes to referenced ID's
</commit_message>
<xml_diff>
--- a/docs/PED v3.0/Tech_stack.docx
+++ b/docs/PED v3.0/Tech_stack.docx
@@ -301,7 +301,7 @@
                 <w:sz w:val="16"/>
                 <w:szCs w:val="16"/>
               </w:rPr>
-              <w:t>Satisfies ASR-010 (REQ-032, NFR-008) by delivering a single responsive web codebase across phone, tablet, laptop, and desktop devices while respecting S-OUT-002 (native apps excluded). Peer-reviewed mobile engineering research confirms that while native apps offer hardware-level optimization, responsive web applications eliminate multi-platform maintenance overhead for small teams (Horn et al., 2023). Aligns with existing team capability (AI-017).</w:t>
+              <w:t>Satisfies ASR-010 (REQ-025) by delivering a single responsive web codebase across phone, tablet, laptop, and desktop devices while respecting S-OUT-002 (native apps excluded). Peer-reviewed mobile engineering research confirms that while native apps offer hardware-level optimization, responsive web applications eliminate multi-platform maintenance overhead for small teams (Horn et al., 2023). Aligns with existing team capability (CON-RES-05).</w:t>
             </w:r>
           </w:p>
         </w:tc>
@@ -463,7 +463,7 @@
                 <w:sz w:val="16"/>
                 <w:szCs w:val="16"/>
               </w:rPr>
-              <w:t xml:space="preserve">Satisfies ASR-005 (REQ-025 &lt;10s processing, REQ-035 &lt;30s submission) and ASR-006 (REQ-037 210 concurrent users) via an event-driven, non-blocking I/O execution model. Nodemailer implements the </w:t>
+              <w:t xml:space="preserve">Satisfies ASR-005 (REQ-019 &lt;10s processing, REQ-027 fast submission) and ASR-006 (REQ-029 210 concurrent users) via an event-driven, non-blocking I/O execution model. Nodemailer implements the </w:t>
             </w:r>
             <w:proofErr w:type="spellStart"/>
             <w:r>
@@ -599,16 +599,66 @@
                 <w:sz w:val="16"/>
                 <w:szCs w:val="16"/>
               </w:rPr>
+              <w:t>Data &amp; Persistence Layer</w:t>
+            </w:r>
+            <w:r>
+              <w:rPr>
+                <w:rFonts w:eastAsia="Calibri" w:cs="Calibri"/>
+                <w:sz w:val="16"/>
+                <w:szCs w:val="16"/>
+              </w:rPr>
+              <w:t xml:space="preserve"> (user, </w:t>
+            </w:r>
+            <w:proofErr w:type="spellStart"/>
+            <w:r>
+              <w:rPr>
+                <w:rFonts w:eastAsia="Calibri" w:cs="Calibri"/>
+                <w:sz w:val="16"/>
+                <w:szCs w:val="16"/>
+              </w:rPr>
               <w:lastRenderedPageBreak/>
-              <w:t>Data &amp; Persistence Layer</w:t>
-            </w:r>
-            <w:r>
-              <w:rPr>
-                <w:rFonts w:eastAsia="Calibri" w:cs="Calibri"/>
-                <w:sz w:val="16"/>
-                <w:szCs w:val="16"/>
-              </w:rPr>
-              <w:t xml:space="preserve"> (user, </w:t>
+              <w:t>service_request</w:t>
+            </w:r>
+            <w:proofErr w:type="spellEnd"/>
+            <w:r>
+              <w:rPr>
+                <w:rFonts w:eastAsia="Calibri" w:cs="Calibri"/>
+                <w:sz w:val="16"/>
+                <w:szCs w:val="16"/>
+              </w:rPr>
+              <w:t>, action, logging tables)</w:t>
+            </w:r>
+          </w:p>
+        </w:tc>
+        <w:tc>
+          <w:tcPr>
+            <w:tcW w:w="1956" w:type="dxa"/>
+          </w:tcPr>
+          <w:p>
+            <w:pPr>
+              <w:rPr>
+                <w:rFonts w:eastAsia="Calibri" w:cs="Calibri"/>
+                <w:sz w:val="16"/>
+                <w:szCs w:val="16"/>
+              </w:rPr>
+            </w:pPr>
+            <w:r>
+              <w:rPr>
+                <w:rFonts w:eastAsia="Calibri" w:cs="Calibri"/>
+                <w:b/>
+                <w:sz w:val="16"/>
+                <w:szCs w:val="16"/>
+              </w:rPr>
+              <w:lastRenderedPageBreak/>
+              <w:t>PostgreSQL</w:t>
+            </w:r>
+            <w:r>
+              <w:rPr>
+                <w:rFonts w:eastAsia="Calibri" w:cs="Calibri"/>
+                <w:sz w:val="16"/>
+                <w:szCs w:val="16"/>
+              </w:rPr>
+              <w:t xml:space="preserve"> + node-</w:t>
             </w:r>
             <w:proofErr w:type="spellStart"/>
             <w:r>
@@ -617,6 +667,95 @@
                 <w:sz w:val="16"/>
                 <w:szCs w:val="16"/>
               </w:rPr>
+              <w:t>postgres</w:t>
+            </w:r>
+            <w:proofErr w:type="spellEnd"/>
+            <w:r>
+              <w:rPr>
+                <w:rFonts w:eastAsia="Calibri" w:cs="Calibri"/>
+                <w:sz w:val="16"/>
+                <w:szCs w:val="16"/>
+              </w:rPr>
+              <w:t xml:space="preserve"> (</w:t>
+            </w:r>
+            <w:proofErr w:type="spellStart"/>
+            <w:r>
+              <w:rPr>
+                <w:rFonts w:eastAsia="Calibri" w:cs="Calibri"/>
+                <w:sz w:val="16"/>
+                <w:szCs w:val="16"/>
+              </w:rPr>
+              <w:t>pg</w:t>
+            </w:r>
+            <w:proofErr w:type="spellEnd"/>
+            <w:r>
+              <w:rPr>
+                <w:rFonts w:eastAsia="Calibri" w:cs="Calibri"/>
+                <w:sz w:val="16"/>
+                <w:szCs w:val="16"/>
+              </w:rPr>
+              <w:t>)</w:t>
+            </w:r>
+          </w:p>
+        </w:tc>
+        <w:tc>
+          <w:tcPr>
+            <w:tcW w:w="1956" w:type="dxa"/>
+          </w:tcPr>
+          <w:p>
+            <w:pPr>
+              <w:rPr>
+                <w:rFonts w:eastAsia="Calibri" w:cs="Calibri"/>
+                <w:sz w:val="16"/>
+                <w:szCs w:val="16"/>
+              </w:rPr>
+            </w:pPr>
+            <w:r>
+              <w:rPr>
+                <w:rFonts w:eastAsia="Calibri" w:cs="Calibri"/>
+                <w:sz w:val="16"/>
+                <w:szCs w:val="16"/>
+              </w:rPr>
+              <w:t>MongoDB (Document NoSQL)</w:t>
+            </w:r>
+          </w:p>
+        </w:tc>
+        <w:tc>
+          <w:tcPr>
+            <w:tcW w:w="1956" w:type="dxa"/>
+          </w:tcPr>
+          <w:p>
+            <w:pPr>
+              <w:rPr>
+                <w:rFonts w:eastAsia="Calibri" w:cs="Calibri"/>
+                <w:sz w:val="16"/>
+                <w:szCs w:val="16"/>
+              </w:rPr>
+            </w:pPr>
+            <w:r>
+              <w:rPr>
+                <w:rFonts w:eastAsia="Calibri" w:cs="Calibri"/>
+                <w:sz w:val="16"/>
+                <w:szCs w:val="16"/>
+              </w:rPr>
+              <w:t xml:space="preserve">Satisfies ASR-007 (REQ-022 uncorrupted transactional storage) </w:t>
+            </w:r>
+            <w:r>
+              <w:rPr>
+                <w:rFonts w:eastAsia="Calibri" w:cs="Calibri"/>
+                <w:sz w:val="16"/>
+                <w:szCs w:val="16"/>
+              </w:rPr>
+              <w:lastRenderedPageBreak/>
+              <w:t xml:space="preserve">and Section 8.4 persistence requirements. Enforces strict ACID transactions and relational foreign keys across the 9-entity normalized schema (user, </w:t>
+            </w:r>
+            <w:proofErr w:type="spellStart"/>
+            <w:r>
+              <w:rPr>
+                <w:rFonts w:eastAsia="Calibri" w:cs="Calibri"/>
+                <w:sz w:val="16"/>
+                <w:szCs w:val="16"/>
+              </w:rPr>
               <w:t>service_request</w:t>
             </w:r>
             <w:proofErr w:type="spellEnd"/>
@@ -626,7 +765,43 @@
                 <w:sz w:val="16"/>
                 <w:szCs w:val="16"/>
               </w:rPr>
-              <w:t>, action, logging tables)</w:t>
+              <w:t xml:space="preserve">, action, log, category, </w:t>
+            </w:r>
+            <w:proofErr w:type="spellStart"/>
+            <w:r>
+              <w:rPr>
+                <w:rFonts w:eastAsia="Calibri" w:cs="Calibri"/>
+                <w:sz w:val="16"/>
+                <w:szCs w:val="16"/>
+              </w:rPr>
+              <w:t>staff_category</w:t>
+            </w:r>
+            <w:proofErr w:type="spellEnd"/>
+            <w:r>
+              <w:rPr>
+                <w:rFonts w:eastAsia="Calibri" w:cs="Calibri"/>
+                <w:sz w:val="16"/>
+                <w:szCs w:val="16"/>
+              </w:rPr>
+              <w:t xml:space="preserve">, verification_token, </w:t>
+            </w:r>
+            <w:proofErr w:type="spellStart"/>
+            <w:r>
+              <w:rPr>
+                <w:rFonts w:eastAsia="Calibri" w:cs="Calibri"/>
+                <w:sz w:val="16"/>
+                <w:szCs w:val="16"/>
+              </w:rPr>
+              <w:t>action_status</w:t>
+            </w:r>
+            <w:proofErr w:type="spellEnd"/>
+            <w:r>
+              <w:rPr>
+                <w:rFonts w:eastAsia="Calibri" w:cs="Calibri"/>
+                <w:sz w:val="16"/>
+                <w:szCs w:val="16"/>
+              </w:rPr>
+              <w:t>, action_type), and domain constraints (NOT NULL, UNIQUE). Replaces simple CHECK constraints with strict referential integrity for statuses and categories. Automated AFTER audit triggers write diagnostic snapshots to the log table (Hellerstein, Stonebraker and Hamilton, 2007).</w:t>
             </w:r>
           </w:p>
         </w:tc>
@@ -645,175 +820,20 @@
             <w:r>
               <w:rPr>
                 <w:rFonts w:eastAsia="Calibri" w:cs="Calibri"/>
-                <w:b/>
-                <w:sz w:val="16"/>
-                <w:szCs w:val="16"/>
-              </w:rPr>
-              <w:t>PostgreSQL</w:t>
-            </w:r>
-            <w:r>
-              <w:rPr>
-                <w:rFonts w:eastAsia="Calibri" w:cs="Calibri"/>
-                <w:sz w:val="16"/>
-                <w:szCs w:val="16"/>
-              </w:rPr>
-              <w:t xml:space="preserve"> + node-</w:t>
-            </w:r>
-            <w:proofErr w:type="spellStart"/>
-            <w:r>
-              <w:rPr>
-                <w:rFonts w:eastAsia="Calibri" w:cs="Calibri"/>
-                <w:sz w:val="16"/>
-                <w:szCs w:val="16"/>
-              </w:rPr>
-              <w:t>postgres</w:t>
-            </w:r>
-            <w:proofErr w:type="spellEnd"/>
-            <w:r>
-              <w:rPr>
-                <w:rFonts w:eastAsia="Calibri" w:cs="Calibri"/>
-                <w:sz w:val="16"/>
-                <w:szCs w:val="16"/>
-              </w:rPr>
-              <w:t xml:space="preserve"> (</w:t>
-            </w:r>
-            <w:proofErr w:type="spellStart"/>
-            <w:r>
-              <w:rPr>
-                <w:rFonts w:eastAsia="Calibri" w:cs="Calibri"/>
-                <w:sz w:val="16"/>
-                <w:szCs w:val="16"/>
-              </w:rPr>
-              <w:t>pg</w:t>
-            </w:r>
-            <w:proofErr w:type="spellEnd"/>
-            <w:r>
-              <w:rPr>
-                <w:rFonts w:eastAsia="Calibri" w:cs="Calibri"/>
-                <w:sz w:val="16"/>
-                <w:szCs w:val="16"/>
-              </w:rPr>
-              <w:t>)</w:t>
-            </w:r>
-          </w:p>
-        </w:tc>
-        <w:tc>
-          <w:tcPr>
-            <w:tcW w:w="1956" w:type="dxa"/>
-          </w:tcPr>
-          <w:p>
-            <w:pPr>
-              <w:rPr>
-                <w:rFonts w:eastAsia="Calibri" w:cs="Calibri"/>
-                <w:sz w:val="16"/>
-                <w:szCs w:val="16"/>
-              </w:rPr>
-            </w:pPr>
-            <w:r>
-              <w:rPr>
-                <w:rFonts w:eastAsia="Calibri" w:cs="Calibri"/>
-                <w:sz w:val="16"/>
-                <w:szCs w:val="16"/>
-              </w:rPr>
-              <w:t>MongoDB (Document NoSQL)</w:t>
-            </w:r>
-          </w:p>
-        </w:tc>
-        <w:tc>
-          <w:tcPr>
-            <w:tcW w:w="1956" w:type="dxa"/>
-          </w:tcPr>
-          <w:p>
-            <w:pPr>
-              <w:rPr>
-                <w:rFonts w:eastAsia="Calibri" w:cs="Calibri"/>
-                <w:sz w:val="16"/>
-                <w:szCs w:val="16"/>
-              </w:rPr>
-            </w:pPr>
-            <w:r>
-              <w:rPr>
-                <w:rFonts w:eastAsia="Calibri" w:cs="Calibri"/>
-                <w:sz w:val="16"/>
-                <w:szCs w:val="16"/>
-              </w:rPr>
-              <w:t xml:space="preserve">Satisfies ASR-007 (REQ-022 uncorrupted transactional storage) and Section 8.4 persistence requirements. Enforces strict ACID transactions, relational foreign keys across the 9-entity normalized schema (user, </w:t>
-            </w:r>
-            <w:proofErr w:type="spellStart"/>
-            <w:r>
-              <w:rPr>
-                <w:rFonts w:eastAsia="Calibri" w:cs="Calibri"/>
-                <w:sz w:val="16"/>
-                <w:szCs w:val="16"/>
-              </w:rPr>
-              <w:t>service_request</w:t>
-            </w:r>
-            <w:proofErr w:type="spellEnd"/>
-            <w:r>
-              <w:rPr>
-                <w:rFonts w:eastAsia="Calibri" w:cs="Calibri"/>
-                <w:sz w:val="16"/>
-                <w:szCs w:val="16"/>
-              </w:rPr>
-              <w:t xml:space="preserve">, action, log, category, </w:t>
-            </w:r>
-            <w:proofErr w:type="spellStart"/>
-            <w:r>
-              <w:rPr>
-                <w:rFonts w:eastAsia="Calibri" w:cs="Calibri"/>
-                <w:sz w:val="16"/>
-                <w:szCs w:val="16"/>
-              </w:rPr>
-              <w:t>staff_category</w:t>
-            </w:r>
-            <w:proofErr w:type="spellEnd"/>
-            <w:r>
-              <w:rPr>
-                <w:rFonts w:eastAsia="Calibri" w:cs="Calibri"/>
-                <w:sz w:val="16"/>
-                <w:szCs w:val="16"/>
-              </w:rPr>
-              <w:t xml:space="preserve">, verification_token, </w:t>
-            </w:r>
-            <w:proofErr w:type="spellStart"/>
-            <w:r>
-              <w:rPr>
-                <w:rFonts w:eastAsia="Calibri" w:cs="Calibri"/>
-                <w:sz w:val="16"/>
-                <w:szCs w:val="16"/>
-              </w:rPr>
-              <w:t>action_status</w:t>
-            </w:r>
-            <w:proofErr w:type="spellEnd"/>
-            <w:r>
-              <w:rPr>
-                <w:rFonts w:eastAsia="Calibri" w:cs="Calibri"/>
-                <w:sz w:val="16"/>
-                <w:szCs w:val="16"/>
-              </w:rPr>
-              <w:t>, action_type), and domain constraints (NOT NULL, UNIQUE). Replaces simple CHECK constraints with strict referential integrity for statuses and categories. Automated AFTER audit triggers write diagnostic snapshots to the log table.</w:t>
-            </w:r>
-          </w:p>
-        </w:tc>
-        <w:tc>
-          <w:tcPr>
-            <w:tcW w:w="1956" w:type="dxa"/>
-          </w:tcPr>
-          <w:p>
-            <w:pPr>
-              <w:rPr>
-                <w:rFonts w:eastAsia="Calibri" w:cs="Calibri"/>
-                <w:sz w:val="16"/>
-                <w:szCs w:val="16"/>
-              </w:rPr>
-            </w:pPr>
-            <w:r>
-              <w:rPr>
-                <w:rFonts w:eastAsia="Calibri" w:cs="Calibri"/>
-                <w:sz w:val="16"/>
-                <w:szCs w:val="16"/>
-              </w:rPr>
-              <w:t>PostgreSQL License (Open-source, R0 cost). Mitigates R06 (corrupted submission/rollback failure).</w:t>
+                <w:sz w:val="16"/>
+                <w:szCs w:val="16"/>
+              </w:rPr>
+              <w:lastRenderedPageBreak/>
+              <w:t xml:space="preserve">PostgreSQL License (Open-source, R0 cost). Mitigates R06 (corrupted </w:t>
+            </w:r>
+            <w:r>
+              <w:rPr>
+                <w:rFonts w:eastAsia="Calibri" w:cs="Calibri"/>
+                <w:sz w:val="16"/>
+                <w:szCs w:val="16"/>
+              </w:rPr>
+              <w:lastRenderedPageBreak/>
+              <w:t>submission/rollback failure).</w:t>
             </w:r>
           </w:p>
         </w:tc>
@@ -840,6 +860,7 @@
                 <w:sz w:val="16"/>
                 <w:szCs w:val="16"/>
               </w:rPr>
+              <w:lastRenderedPageBreak/>
               <w:t>Authentication &amp; Credential Security</w:t>
             </w:r>
           </w:p>
@@ -959,23 +980,13 @@
                 <w:szCs w:val="16"/>
               </w:rPr>
             </w:pPr>
-            <w:proofErr w:type="spellStart"/>
-            <w:r>
-              <w:rPr>
-                <w:rFonts w:eastAsia="Calibri" w:cs="Calibri"/>
-                <w:sz w:val="16"/>
-                <w:szCs w:val="16"/>
-              </w:rPr>
-              <w:t>bcrypt</w:t>
-            </w:r>
-            <w:proofErr w:type="spellEnd"/>
-            <w:r>
-              <w:rPr>
-                <w:rFonts w:eastAsia="Calibri" w:cs="Calibri"/>
-                <w:sz w:val="16"/>
-                <w:szCs w:val="16"/>
-              </w:rPr>
-              <w:t xml:space="preserve"> satisfies baseline ASR-003 (REQ-030 / NFR-006) by hashing </w:t>
+            <w:r>
+              <w:rPr>
+                <w:rFonts w:eastAsia="Calibri" w:cs="Calibri"/>
+                <w:sz w:val="16"/>
+                <w:szCs w:val="16"/>
+              </w:rPr>
+              <w:t xml:space="preserve">Satisfies baseline ASR-003 (REQ-024) by hashing </w:t>
             </w:r>
             <w:proofErr w:type="gramStart"/>
             <w:r>
@@ -993,7 +1004,7 @@
                 <w:sz w:val="16"/>
                 <w:szCs w:val="16"/>
               </w:rPr>
-              <w:t xml:space="preserve"> before persistence (while Node's built-in crypto SHA-256 supports hashed login_token secrets if CR-004/D13 is adopted). Stateless JWT middleware encodes user_id and user_type (requester, staff, management) to satisfy ASR-002 (REQ-029 RBAC) and ASR-006 (210 concurrent users without session-store memory bottlenecks) (Marquis, 2024).</w:t>
+              <w:t xml:space="preserve"> before persistence (while Node's built-in crypto SHA-256 supports hashed verification tokens under CR-004/D13/CR-008). Stateless JWT middleware encodes user_id and user_type (requester, staff, management) to satisfy ASR-002 (REQ-023 RBAC) and ASR-006 (210 concurrent users without session-store memory bottlenecks) (Marquis, 2024).</w:t>
             </w:r>
           </w:p>
         </w:tc>

</xml_diff>